<commit_message>
fix: update GST slabs to GST 2.0 four-tier system (0/5/18/40%)
</commit_message>
<xml_diff>
--- a/Kirana_Agent_Project_Document.docx
+++ b/Kirana_Agent_Project_Document.docx
@@ -89,7 +89,7 @@
           <w:sz w:val="22"/>
           <w:szCs w:val="22"/>
         </w:rPr>
-        <w:t xml:space="preserve">Document generated: 27 July 2026</w:t>
+        <w:t xml:space="preserve">Document generated: 30 July 2026</w:t>
       </w:r>
     </w:p>
     <w:p>
@@ -618,7 +618,7 @@
           <w:sz w:val="22"/>
           <w:szCs w:val="22"/>
         </w:rPr>
-        <w:t xml:space="preserve">GST compliance requires proper slab-wise tax calculation (0%, 5%, 12%, 18%, 28%)</w:t>
+        <w:t xml:space="preserve">GST compliance requires proper slab-wise tax calculation (0%, 5%, 18%, 40%)</w:t>
       </w:r>
     </w:p>
     <w:p>
@@ -1984,7 +1984,7 @@
           <w:sz w:val="22"/>
           <w:szCs w:val="22"/>
         </w:rPr>
-        <w:t xml:space="preserve">Allowed GST rates constrained: CHECK constraint limits to 0, 5, 12, 18, 28 — the actual Indian GST slabs</w:t>
+        <w:t xml:space="preserve">Allowed GST rates constrained: CHECK constraint limits to 0, 5, 18, 40 — the actual Indian GST slabs</w:t>
       </w:r>
     </w:p>
     <w:p>
@@ -3600,7 +3600,7 @@
                 <w:sz w:val="20"/>
                 <w:szCs w:val="20"/>
               </w:rPr>
-              <w:t xml:space="preserve">milk, fresh vegetable, vegetable, fruit, egg</w:t>
+              <w:t xml:space="preserve">milk, fresh vegetable, vegetable, fruit, egg, tetra-pack milk, loose staples (atta, rice, dal, chawal, gehun)</w:t>
             </w:r>
           </w:p>
         </w:tc>
@@ -3644,7 +3644,7 @@
                 <w:sz w:val="20"/>
                 <w:szCs w:val="20"/>
               </w:rPr>
-              <w:t xml:space="preserve">atta, flour, rice, dal, pulse, tea, coffee, biscuit, namkeen, sugar, salt, oil</w:t>
+              <w:t xml:space="preserve">packaged/branded staples, ghee, butter, cheese, juice, chips, tea, coffee, biscuit, namkeen, sugar, salt, oil</w:t>
             </w:r>
           </w:p>
         </w:tc>
@@ -3667,28 +3667,28 @@
                 <w:sz w:val="20"/>
                 <w:szCs w:val="20"/>
               </w:rPr>
-              <w:t xml:space="preserve">12%</w:t>
-            </w:r>
-          </w:p>
-        </w:tc>
-        <w:tc>
-          <w:tcPr>
-            <w:tcBorders>
-              <w:top w:val="single" w:color="B9C7BA" w:sz="1"/>
-              <w:left w:val="single" w:color="B9C7BA" w:sz="1"/>
-              <w:bottom w:val="single" w:color="B9C7BA" w:sz="1"/>
-              <w:right w:val="single" w:color="B9C7BA" w:sz="1"/>
-            </w:tcBorders>
-          </w:tcPr>
-          <w:p>
-            <w:r>
-              <w:rPr>
-                <w:rFonts w:ascii="Calibri" w:cs="Calibri" w:eastAsia="Calibri" w:hAnsi="Calibri"/>
-                <w:color w:val="1E2A22"/>
-                <w:sz w:val="20"/>
-                <w:szCs w:val="20"/>
-              </w:rPr>
-              <w:t xml:space="preserve">butter, ghee, cheese, juice</w:t>
+              <w:t xml:space="preserve">18%</w:t>
+            </w:r>
+          </w:p>
+        </w:tc>
+        <w:tc>
+          <w:tcPr>
+            <w:tcBorders>
+              <w:top w:val="single" w:color="B9C7BA" w:sz="1"/>
+              <w:left w:val="single" w:color="B9C7BA" w:sz="1"/>
+              <w:bottom w:val="single" w:color="B9C7BA" w:sz="1"/>
+              <w:right w:val="single" w:color="B9C7BA" w:sz="1"/>
+            </w:tcBorders>
+          </w:tcPr>
+          <w:p>
+            <w:r>
+              <w:rPr>
+                <w:rFonts w:ascii="Calibri" w:cs="Calibri" w:eastAsia="Calibri" w:hAnsi="Calibri"/>
+                <w:color w:val="1E2A22"/>
+                <w:sz w:val="20"/>
+                <w:szCs w:val="20"/>
+              </w:rPr>
+              <w:t xml:space="preserve">soap, detergent, shampoo, toothpaste, dishwash, dish soap</w:t>
             </w:r>
           </w:p>
         </w:tc>
@@ -3711,72 +3711,28 @@
                 <w:sz w:val="20"/>
                 <w:szCs w:val="20"/>
               </w:rPr>
-              <w:t xml:space="preserve">18%</w:t>
-            </w:r>
-          </w:p>
-        </w:tc>
-        <w:tc>
-          <w:tcPr>
-            <w:tcBorders>
-              <w:top w:val="single" w:color="B9C7BA" w:sz="1"/>
-              <w:left w:val="single" w:color="B9C7BA" w:sz="1"/>
-              <w:bottom w:val="single" w:color="B9C7BA" w:sz="1"/>
-              <w:right w:val="single" w:color="B9C7BA" w:sz="1"/>
-            </w:tcBorders>
-          </w:tcPr>
-          <w:p>
-            <w:r>
-              <w:rPr>
-                <w:rFonts w:ascii="Calibri" w:cs="Calibri" w:eastAsia="Calibri" w:hAnsi="Calibri"/>
-                <w:color w:val="1E2A22"/>
-                <w:sz w:val="20"/>
-                <w:szCs w:val="20"/>
-              </w:rPr>
-              <w:t xml:space="preserve">soap, detergent, shampoo, toothpaste, dishwash, dish soap</w:t>
-            </w:r>
-          </w:p>
-        </w:tc>
-      </w:tr>
-      <w:tr>
-        <w:tc>
-          <w:tcPr>
-            <w:tcBorders>
-              <w:top w:val="single" w:color="B9C7BA" w:sz="1"/>
-              <w:left w:val="single" w:color="B9C7BA" w:sz="1"/>
-              <w:bottom w:val="single" w:color="B9C7BA" w:sz="1"/>
-              <w:right w:val="single" w:color="B9C7BA" w:sz="1"/>
-            </w:tcBorders>
-          </w:tcPr>
-          <w:p>
-            <w:r>
-              <w:rPr>
-                <w:rFonts w:ascii="Calibri" w:cs="Calibri" w:eastAsia="Calibri" w:hAnsi="Calibri"/>
-                <w:color w:val="1E2A22"/>
-                <w:sz w:val="20"/>
-                <w:szCs w:val="20"/>
-              </w:rPr>
-              <w:t xml:space="preserve">28%</w:t>
-            </w:r>
-          </w:p>
-        </w:tc>
-        <w:tc>
-          <w:tcPr>
-            <w:tcBorders>
-              <w:top w:val="single" w:color="B9C7BA" w:sz="1"/>
-              <w:left w:val="single" w:color="B9C7BA" w:sz="1"/>
-              <w:bottom w:val="single" w:color="B9C7BA" w:sz="1"/>
-              <w:right w:val="single" w:color="B9C7BA" w:sz="1"/>
-            </w:tcBorders>
-          </w:tcPr>
-          <w:p>
-            <w:r>
-              <w:rPr>
-                <w:rFonts w:ascii="Calibri" w:cs="Calibri" w:eastAsia="Calibri" w:hAnsi="Calibri"/>
-                <w:color w:val="1E2A22"/>
-                <w:sz w:val="20"/>
-                <w:szCs w:val="20"/>
-              </w:rPr>
-              <w:t xml:space="preserve">cold drink, aerated, chips, pan masala</w:t>
+              <w:t xml:space="preserve">40%</w:t>
+            </w:r>
+          </w:p>
+        </w:tc>
+        <w:tc>
+          <w:tcPr>
+            <w:tcBorders>
+              <w:top w:val="single" w:color="B9C7BA" w:sz="1"/>
+              <w:left w:val="single" w:color="B9C7BA" w:sz="1"/>
+              <w:bottom w:val="single" w:color="B9C7BA" w:sz="1"/>
+              <w:right w:val="single" w:color="B9C7BA" w:sz="1"/>
+            </w:tcBorders>
+          </w:tcPr>
+          <w:p>
+            <w:r>
+              <w:rPr>
+                <w:rFonts w:ascii="Calibri" w:cs="Calibri" w:eastAsia="Calibri" w:hAnsi="Calibri"/>
+                <w:color w:val="1E2A22"/>
+                <w:sz w:val="20"/>
+                <w:szCs w:val="20"/>
+              </w:rPr>
+              <w:t xml:space="preserve">cold drink, aerated drink, pan masala</w:t>
             </w:r>
           </w:p>
         </w:tc>

</xml_diff>